<commit_message>
Le feuillet n'est pas le registre, et ne prétend plus l'être
Le registre des mouvements de titres se tient au siège, sur support papier ou
sur tout autre support durable, par la société ou par qui elle mandate - c'est
l'article R. 228-8 du code de commerce. Ce n'est pas un document qu'une
formalité produit.

Le corps du document le disait déjà - « destiné à être reporté au registre tenu
par la Société » - mais son titre affirmait le contraire : REGISTRE DES
MOUVEMENTS DE TITRES, en tête d'une feuille éditée par le dossier. Il s'intitule
désormais « Inscriptions à porter au registre des mouvements de titres », la
phrase d'introduction cite le texte et dit où le registre se tient, et l'écran
nomme l'acte de la même façon.

Co-Authored-By: Claude Opus 5 <noreply@anthropic.com>
Claude-Session: https://claude.ai/code/session_018eb2Lhd3tJmGirqQ9fym3N
</commit_message>
<xml_diff>
--- a/templates/modif-air-registre-titres.docx
+++ b/templates/modif-air-registre-titres.docx
@@ -80,7 +80,7 @@
           <w:b w:val="1"/>
           <w:rtl w:val="0"/>
         </w:rPr>
-        <w:t xml:space="preserve">REGISTRE DES MOUVEMENTS DE TITRES</w:t>
+        <w:t xml:space="preserve">INSCRIPTIONS À PORTER AU REGISTRE DES MOUVEMENTS DE TITRES</w:t>
       </w:r>
     </w:p>
     <w:p>
@@ -111,7 +111,7 @@
           <w:rFonts w:ascii="Cambria" w:cs="Cambria" w:eastAsia="Cambria" w:hAnsi="Cambria"/>
           <w:rtl w:val="0"/>
         </w:rPr>
-        <w:t xml:space="preserve">Les actions créées par l'exercice des bons de souscription d'actions sont inscrites ci-après, à la date à laquelle l'augmentation de capital a été définitivement réalisée. Le présent feuillet est destiné à être reporté au registre des mouvements de titres tenu par la Société.</w:t>
+        <w:t xml:space="preserve">Les actions créées par l'exercice des bons de souscription d'actions sont inscrites ci-après, à la date à laquelle l'augmentation de capital a été définitivement réalisée. Le présent feuillet n'est pas le registre : il est destiné à être reporté au registre des mouvements de titres que la Société tient à son siège, sur support papier ou sur tout autre support durable (article R. 228-8 du code de commerce).</w:t>
       </w:r>
     </w:p>
     <w:tbl>

</xml_diff>